<commit_message>
Optimize monthly product grade workflow
</commit_message>
<xml_diff>
--- a/xf-report-filler/resources/monthly_templates/01_产品巡查底册模板.docx
+++ b/xf-report-filler/resources/monthly_templates/01_产品巡查底册模板.docx
@@ -123,6 +123,7 @@
           <w:b/>
           <w:bCs/>
           <w:sz w:val="24"/>
+          <w:lang w:eastAsia="zh-CN"/>
         </w:rPr>
       </w:pPr>
       <w:r>
@@ -134,6 +135,16 @@
         </w:rPr>
         <w:t>1、</w:t>
       </w:r>
+      <w:r>
+        <w:rPr>
+          <w:rFonts w:hint="eastAsia" w:ascii="仿宋" w:hAnsi="仿宋" w:eastAsia="仿宋"/>
+          <w:b/>
+          <w:bCs/>
+          <w:sz w:val="24"/>
+          <w:lang w:eastAsia="zh-CN"/>
+        </w:rPr>
+        <w:t>（）</w:t>
+      </w:r>
     </w:p>
     <w:p>
       <w:pPr>
@@ -161,6 +172,7 @@
           <w:b/>
           <w:bCs/>
           <w:sz w:val="24"/>
+          <w:lang w:eastAsia="zh-CN"/>
         </w:rPr>
       </w:pPr>
       <w:r>
@@ -172,6 +184,16 @@
         </w:rPr>
         <w:t>2、</w:t>
       </w:r>
+      <w:r>
+        <w:rPr>
+          <w:rFonts w:hint="eastAsia" w:ascii="仿宋" w:hAnsi="仿宋" w:eastAsia="仿宋"/>
+          <w:b/>
+          <w:bCs/>
+          <w:sz w:val="24"/>
+          <w:lang w:eastAsia="zh-CN"/>
+        </w:rPr>
+        <w:t>（）</w:t>
+      </w:r>
     </w:p>
     <w:p>
       <w:pPr>
@@ -199,6 +221,7 @@
           <w:b/>
           <w:bCs/>
           <w:sz w:val="24"/>
+          <w:lang w:eastAsia="zh-CN"/>
         </w:rPr>
       </w:pPr>
       <w:r>
@@ -210,6 +233,16 @@
         </w:rPr>
         <w:t>3、</w:t>
       </w:r>
+      <w:r>
+        <w:rPr>
+          <w:rFonts w:hint="eastAsia" w:ascii="仿宋" w:hAnsi="仿宋" w:eastAsia="仿宋"/>
+          <w:b/>
+          <w:bCs/>
+          <w:sz w:val="24"/>
+          <w:lang w:eastAsia="zh-CN"/>
+        </w:rPr>
+        <w:t>（）</w:t>
+      </w:r>
     </w:p>
     <w:p>
       <w:pPr>
@@ -370,6 +403,7 @@
           <w:b/>
           <w:bCs/>
           <w:sz w:val="24"/>
+          <w:lang w:eastAsia="zh-CN"/>
         </w:rPr>
       </w:pPr>
       <w:r>
@@ -381,6 +415,16 @@
         </w:rPr>
         <w:t>1、</w:t>
       </w:r>
+      <w:r>
+        <w:rPr>
+          <w:rFonts w:hint="eastAsia" w:ascii="仿宋" w:hAnsi="仿宋" w:eastAsia="仿宋"/>
+          <w:b/>
+          <w:bCs/>
+          <w:sz w:val="24"/>
+          <w:lang w:eastAsia="zh-CN"/>
+        </w:rPr>
+        <w:t>（）</w:t>
+      </w:r>
     </w:p>
     <w:p>
       <w:pPr>
@@ -408,6 +452,7 @@
           <w:b/>
           <w:bCs/>
           <w:sz w:val="24"/>
+          <w:lang w:eastAsia="zh-CN"/>
         </w:rPr>
       </w:pPr>
       <w:r>
@@ -419,6 +464,16 @@
         </w:rPr>
         <w:t>2、</w:t>
       </w:r>
+      <w:r>
+        <w:rPr>
+          <w:rFonts w:hint="eastAsia" w:ascii="仿宋" w:hAnsi="仿宋" w:eastAsia="仿宋"/>
+          <w:b/>
+          <w:bCs/>
+          <w:sz w:val="24"/>
+          <w:lang w:eastAsia="zh-CN"/>
+        </w:rPr>
+        <w:t>（）</w:t>
+      </w:r>
     </w:p>
     <w:p>
       <w:pPr>
@@ -446,6 +501,7 @@
           <w:b/>
           <w:bCs/>
           <w:sz w:val="24"/>
+          <w:lang w:eastAsia="zh-CN"/>
         </w:rPr>
       </w:pPr>
       <w:r>
@@ -457,6 +513,16 @@
         </w:rPr>
         <w:t>3、</w:t>
       </w:r>
+      <w:r>
+        <w:rPr>
+          <w:rFonts w:hint="eastAsia" w:ascii="仿宋" w:hAnsi="仿宋" w:eastAsia="仿宋"/>
+          <w:b/>
+          <w:bCs/>
+          <w:sz w:val="24"/>
+          <w:lang w:eastAsia="zh-CN"/>
+        </w:rPr>
+        <w:t>（）</w:t>
+      </w:r>
     </w:p>
     <w:p>
       <w:pPr>
@@ -617,6 +683,7 @@
           <w:b/>
           <w:bCs/>
           <w:sz w:val="24"/>
+          <w:lang w:eastAsia="zh-CN"/>
         </w:rPr>
       </w:pPr>
       <w:r>
@@ -628,6 +695,16 @@
         </w:rPr>
         <w:t>1、</w:t>
       </w:r>
+      <w:r>
+        <w:rPr>
+          <w:rFonts w:hint="eastAsia" w:ascii="仿宋" w:hAnsi="仿宋" w:eastAsia="仿宋"/>
+          <w:b/>
+          <w:bCs/>
+          <w:sz w:val="24"/>
+          <w:lang w:eastAsia="zh-CN"/>
+        </w:rPr>
+        <w:t>（）</w:t>
+      </w:r>
     </w:p>
     <w:p>
       <w:pPr>
@@ -655,6 +732,7 @@
           <w:b/>
           <w:bCs/>
           <w:sz w:val="24"/>
+          <w:lang w:eastAsia="zh-CN"/>
         </w:rPr>
       </w:pPr>
       <w:r>
@@ -666,6 +744,16 @@
         </w:rPr>
         <w:t>2、</w:t>
       </w:r>
+      <w:r>
+        <w:rPr>
+          <w:rFonts w:hint="eastAsia" w:ascii="仿宋" w:hAnsi="仿宋" w:eastAsia="仿宋"/>
+          <w:b/>
+          <w:bCs/>
+          <w:sz w:val="24"/>
+          <w:lang w:eastAsia="zh-CN"/>
+        </w:rPr>
+        <w:t>（）</w:t>
+      </w:r>
     </w:p>
     <w:p>
       <w:pPr>
@@ -693,6 +781,7 @@
           <w:b/>
           <w:bCs/>
           <w:sz w:val="24"/>
+          <w:lang w:eastAsia="zh-CN"/>
         </w:rPr>
       </w:pPr>
       <w:r>
@@ -704,6 +793,16 @@
         </w:rPr>
         <w:t>3、</w:t>
       </w:r>
+      <w:r>
+        <w:rPr>
+          <w:rFonts w:hint="eastAsia" w:ascii="仿宋" w:hAnsi="仿宋" w:eastAsia="仿宋"/>
+          <w:b/>
+          <w:bCs/>
+          <w:sz w:val="24"/>
+          <w:lang w:eastAsia="zh-CN"/>
+        </w:rPr>
+        <w:t>（）</w:t>
+      </w:r>
     </w:p>
     <w:p>
       <w:pPr>
@@ -864,6 +963,7 @@
           <w:b/>
           <w:bCs/>
           <w:sz w:val="24"/>
+          <w:lang w:eastAsia="zh-CN"/>
         </w:rPr>
       </w:pPr>
       <w:r>
@@ -875,6 +975,16 @@
         </w:rPr>
         <w:t>1、</w:t>
       </w:r>
+      <w:r>
+        <w:rPr>
+          <w:rFonts w:hint="eastAsia" w:ascii="仿宋" w:hAnsi="仿宋" w:eastAsia="仿宋"/>
+          <w:b/>
+          <w:bCs/>
+          <w:sz w:val="24"/>
+          <w:lang w:eastAsia="zh-CN"/>
+        </w:rPr>
+        <w:t>（）</w:t>
+      </w:r>
     </w:p>
     <w:p>
       <w:pPr>
@@ -902,6 +1012,7 @@
           <w:b/>
           <w:bCs/>
           <w:sz w:val="24"/>
+          <w:lang w:eastAsia="zh-CN"/>
         </w:rPr>
       </w:pPr>
       <w:r>
@@ -913,6 +1024,16 @@
         </w:rPr>
         <w:t>2、</w:t>
       </w:r>
+      <w:r>
+        <w:rPr>
+          <w:rFonts w:hint="eastAsia" w:ascii="仿宋" w:hAnsi="仿宋" w:eastAsia="仿宋"/>
+          <w:b/>
+          <w:bCs/>
+          <w:sz w:val="24"/>
+          <w:lang w:eastAsia="zh-CN"/>
+        </w:rPr>
+        <w:t>（）</w:t>
+      </w:r>
     </w:p>
     <w:p>
       <w:pPr>
@@ -940,6 +1061,7 @@
           <w:b/>
           <w:bCs/>
           <w:sz w:val="24"/>
+          <w:lang w:eastAsia="zh-CN"/>
         </w:rPr>
       </w:pPr>
       <w:r>
@@ -951,6 +1073,16 @@
         </w:rPr>
         <w:t>3、</w:t>
       </w:r>
+      <w:r>
+        <w:rPr>
+          <w:rFonts w:hint="eastAsia" w:ascii="仿宋" w:hAnsi="仿宋" w:eastAsia="仿宋"/>
+          <w:b/>
+          <w:bCs/>
+          <w:sz w:val="24"/>
+          <w:lang w:eastAsia="zh-CN"/>
+        </w:rPr>
+        <w:t>（）</w:t>
+      </w:r>
     </w:p>
     <w:p>
       <w:pPr>
@@ -1111,6 +1243,7 @@
           <w:b/>
           <w:bCs/>
           <w:sz w:val="24"/>
+          <w:lang w:eastAsia="zh-CN"/>
         </w:rPr>
       </w:pPr>
       <w:r>
@@ -1122,6 +1255,16 @@
         </w:rPr>
         <w:t>1、</w:t>
       </w:r>
+      <w:r>
+        <w:rPr>
+          <w:rFonts w:hint="eastAsia" w:ascii="仿宋" w:hAnsi="仿宋" w:eastAsia="仿宋"/>
+          <w:b/>
+          <w:bCs/>
+          <w:sz w:val="24"/>
+          <w:lang w:eastAsia="zh-CN"/>
+        </w:rPr>
+        <w:t>（）</w:t>
+      </w:r>
     </w:p>
     <w:p>
       <w:pPr>
@@ -1149,6 +1292,7 @@
           <w:b/>
           <w:bCs/>
           <w:sz w:val="24"/>
+          <w:lang w:eastAsia="zh-CN"/>
         </w:rPr>
       </w:pPr>
       <w:r>
@@ -1160,6 +1304,16 @@
         </w:rPr>
         <w:t>2、</w:t>
       </w:r>
+      <w:r>
+        <w:rPr>
+          <w:rFonts w:hint="eastAsia" w:ascii="仿宋" w:hAnsi="仿宋" w:eastAsia="仿宋"/>
+          <w:b/>
+          <w:bCs/>
+          <w:sz w:val="24"/>
+          <w:lang w:eastAsia="zh-CN"/>
+        </w:rPr>
+        <w:t>（）</w:t>
+      </w:r>
     </w:p>
     <w:p>
       <w:pPr>
@@ -1187,6 +1341,7 @@
           <w:b/>
           <w:bCs/>
           <w:sz w:val="24"/>
+          <w:lang w:eastAsia="zh-CN"/>
         </w:rPr>
       </w:pPr>
       <w:r>
@@ -1198,6 +1353,16 @@
         </w:rPr>
         <w:t>3、</w:t>
       </w:r>
+      <w:r>
+        <w:rPr>
+          <w:rFonts w:hint="eastAsia" w:ascii="仿宋" w:hAnsi="仿宋" w:eastAsia="仿宋"/>
+          <w:b/>
+          <w:bCs/>
+          <w:sz w:val="24"/>
+          <w:lang w:eastAsia="zh-CN"/>
+        </w:rPr>
+        <w:t>（）</w:t>
+      </w:r>
     </w:p>
     <w:p>
       <w:pPr>
@@ -1358,6 +1523,7 @@
           <w:b/>
           <w:bCs/>
           <w:sz w:val="24"/>
+          <w:lang w:eastAsia="zh-CN"/>
         </w:rPr>
       </w:pPr>
       <w:r>
@@ -1369,6 +1535,16 @@
         </w:rPr>
         <w:t>1、</w:t>
       </w:r>
+      <w:r>
+        <w:rPr>
+          <w:rFonts w:hint="eastAsia" w:ascii="仿宋" w:hAnsi="仿宋" w:eastAsia="仿宋"/>
+          <w:b/>
+          <w:bCs/>
+          <w:sz w:val="24"/>
+          <w:lang w:eastAsia="zh-CN"/>
+        </w:rPr>
+        <w:t>（）</w:t>
+      </w:r>
     </w:p>
     <w:p>
       <w:pPr>
@@ -1396,6 +1572,7 @@
           <w:b/>
           <w:bCs/>
           <w:sz w:val="24"/>
+          <w:lang w:eastAsia="zh-CN"/>
         </w:rPr>
       </w:pPr>
       <w:r>
@@ -1407,6 +1584,16 @@
         </w:rPr>
         <w:t>2、</w:t>
       </w:r>
+      <w:r>
+        <w:rPr>
+          <w:rFonts w:hint="eastAsia" w:ascii="仿宋" w:hAnsi="仿宋" w:eastAsia="仿宋"/>
+          <w:b/>
+          <w:bCs/>
+          <w:sz w:val="24"/>
+          <w:lang w:eastAsia="zh-CN"/>
+        </w:rPr>
+        <w:t>（）</w:t>
+      </w:r>
     </w:p>
     <w:p>
       <w:pPr>
@@ -1434,6 +1621,7 @@
           <w:b/>
           <w:bCs/>
           <w:sz w:val="24"/>
+          <w:lang w:eastAsia="zh-CN"/>
         </w:rPr>
       </w:pPr>
       <w:r>
@@ -1445,6 +1633,16 @@
         </w:rPr>
         <w:t>3、</w:t>
       </w:r>
+      <w:r>
+        <w:rPr>
+          <w:rFonts w:hint="eastAsia" w:ascii="仿宋" w:hAnsi="仿宋" w:eastAsia="仿宋"/>
+          <w:b/>
+          <w:bCs/>
+          <w:sz w:val="24"/>
+          <w:lang w:eastAsia="zh-CN"/>
+        </w:rPr>
+        <w:t>（）</w:t>
+      </w:r>
     </w:p>
     <w:p>
       <w:pPr>
@@ -1606,6 +1804,7 @@
           <w:b/>
           <w:bCs/>
           <w:sz w:val="24"/>
+          <w:lang w:eastAsia="zh-CN"/>
         </w:rPr>
       </w:pPr>
       <w:r>
@@ -1617,6 +1816,16 @@
         </w:rPr>
         <w:t>1、</w:t>
       </w:r>
+      <w:r>
+        <w:rPr>
+          <w:rFonts w:hint="eastAsia" w:ascii="仿宋" w:hAnsi="仿宋" w:eastAsia="仿宋"/>
+          <w:b/>
+          <w:bCs/>
+          <w:sz w:val="24"/>
+          <w:lang w:eastAsia="zh-CN"/>
+        </w:rPr>
+        <w:t>（）</w:t>
+      </w:r>
     </w:p>
     <w:p>
       <w:pPr>
@@ -1644,6 +1853,7 @@
           <w:b/>
           <w:bCs/>
           <w:sz w:val="24"/>
+          <w:lang w:eastAsia="zh-CN"/>
         </w:rPr>
       </w:pPr>
       <w:r>
@@ -1655,6 +1865,16 @@
         </w:rPr>
         <w:t>2、</w:t>
       </w:r>
+      <w:r>
+        <w:rPr>
+          <w:rFonts w:hint="eastAsia" w:ascii="仿宋" w:hAnsi="仿宋" w:eastAsia="仿宋"/>
+          <w:b/>
+          <w:bCs/>
+          <w:sz w:val="24"/>
+          <w:lang w:eastAsia="zh-CN"/>
+        </w:rPr>
+        <w:t>（）</w:t>
+      </w:r>
     </w:p>
     <w:p>
       <w:pPr>
@@ -1682,6 +1902,7 @@
           <w:b/>
           <w:bCs/>
           <w:sz w:val="24"/>
+          <w:lang w:eastAsia="zh-CN"/>
         </w:rPr>
       </w:pPr>
       <w:r>
@@ -1693,6 +1914,16 @@
         </w:rPr>
         <w:t>3、</w:t>
       </w:r>
+      <w:r>
+        <w:rPr>
+          <w:rFonts w:hint="eastAsia" w:ascii="仿宋" w:hAnsi="仿宋" w:eastAsia="仿宋"/>
+          <w:b/>
+          <w:bCs/>
+          <w:sz w:val="24"/>
+          <w:lang w:eastAsia="zh-CN"/>
+        </w:rPr>
+        <w:t>（）</w:t>
+      </w:r>
     </w:p>
     <w:p>
       <w:pPr>
@@ -1730,6 +1961,277 @@
           <w:sz w:val="24"/>
         </w:rPr>
         <w:br w:type="page"/>
+      </w:r>
+    </w:p>
+    <w:p>
+      <w:pPr>
+        <w:rPr>
+          <w:rFonts w:hint="eastAsia" w:ascii="仿宋" w:hAnsi="仿宋" w:eastAsia="仿宋"/>
+          <w:b/>
+          <w:bCs/>
+          <w:sz w:val="24"/>
+        </w:rPr>
+      </w:pPr>
+    </w:p>
+    <w:p>
+      <w:pPr>
+        <w:rPr>
+          <w:rFonts w:hint="eastAsia" w:ascii="仿宋" w:hAnsi="仿宋" w:eastAsia="仿宋"/>
+          <w:b/>
+          <w:bCs/>
+          <w:sz w:val="24"/>
+        </w:rPr>
+      </w:pPr>
+      <w:r>
+        <w:rPr>
+          <w:rFonts w:hint="eastAsia" w:ascii="仿宋" w:hAnsi="仿宋" w:eastAsia="仿宋"/>
+          <w:b/>
+          <w:bCs/>
+          <w:sz w:val="24"/>
+        </w:rPr>
+        <w:t>大队：经开大队</w:t>
+      </w:r>
+    </w:p>
+    <w:p>
+      <w:pPr>
+        <w:rPr>
+          <w:rFonts w:ascii="仿宋" w:hAnsi="仿宋" w:eastAsia="仿宋"/>
+          <w:b/>
+          <w:bCs/>
+          <w:sz w:val="24"/>
+        </w:rPr>
+      </w:pPr>
+      <w:r>
+        <w:rPr>
+          <w:rFonts w:hint="eastAsia" w:ascii="仿宋" w:hAnsi="仿宋" w:eastAsia="仿宋"/>
+          <w:b/>
+          <w:bCs/>
+          <w:sz w:val="24"/>
+        </w:rPr>
+        <w:t>题名：</w:t>
+      </w:r>
+    </w:p>
+    <w:p>
+      <w:pPr>
+        <w:rPr>
+          <w:rFonts w:hint="eastAsia" w:ascii="仿宋" w:hAnsi="仿宋" w:eastAsia="仿宋"/>
+          <w:b/>
+          <w:bCs/>
+          <w:sz w:val="24"/>
+        </w:rPr>
+      </w:pPr>
+      <w:r>
+        <w:rPr>
+          <w:rFonts w:hint="eastAsia" w:ascii="仿宋" w:hAnsi="仿宋" w:eastAsia="仿宋"/>
+          <w:b/>
+          <w:bCs/>
+          <w:sz w:val="24"/>
+        </w:rPr>
+        <w:t>编号：</w:t>
+      </w:r>
+    </w:p>
+    <w:p>
+      <w:pPr>
+        <w:rPr>
+          <w:rFonts w:ascii="仿宋" w:hAnsi="仿宋" w:eastAsia="仿宋"/>
+          <w:b/>
+          <w:bCs/>
+          <w:sz w:val="24"/>
+        </w:rPr>
+      </w:pPr>
+      <w:r>
+        <w:rPr>
+          <w:rFonts w:hint="eastAsia" w:ascii="仿宋" w:hAnsi="仿宋" w:eastAsia="仿宋"/>
+          <w:b/>
+          <w:bCs/>
+          <w:sz w:val="24"/>
+        </w:rPr>
+        <w:t>立卷人：</w:t>
+      </w:r>
+    </w:p>
+    <w:p>
+      <w:pPr>
+        <w:rPr>
+          <w:rFonts w:hint="eastAsia" w:ascii="仿宋" w:hAnsi="仿宋" w:eastAsia="仿宋"/>
+          <w:b/>
+          <w:bCs/>
+          <w:sz w:val="24"/>
+        </w:rPr>
+      </w:pPr>
+      <w:r>
+        <w:rPr>
+          <w:rFonts w:hint="eastAsia" w:ascii="仿宋" w:hAnsi="仿宋" w:eastAsia="仿宋"/>
+          <w:b/>
+          <w:bCs/>
+          <w:sz w:val="24"/>
+        </w:rPr>
+        <w:t>检查人：</w:t>
+      </w:r>
+    </w:p>
+    <w:p>
+      <w:pPr>
+        <w:rPr>
+          <w:rFonts w:hint="eastAsia" w:ascii="仿宋" w:hAnsi="仿宋" w:eastAsia="仿宋"/>
+          <w:b/>
+          <w:bCs/>
+          <w:sz w:val="24"/>
+        </w:rPr>
+      </w:pPr>
+      <w:r>
+        <w:rPr>
+          <w:rFonts w:hint="eastAsia" w:ascii="仿宋" w:hAnsi="仿宋" w:eastAsia="仿宋"/>
+          <w:b/>
+          <w:bCs/>
+          <w:sz w:val="24"/>
+        </w:rPr>
+        <w:t>错误</w:t>
+      </w:r>
+    </w:p>
+    <w:p>
+      <w:pPr>
+        <w:rPr>
+          <w:rFonts w:hint="eastAsia" w:ascii="仿宋" w:hAnsi="仿宋" w:eastAsia="仿宋"/>
+          <w:b/>
+          <w:bCs/>
+          <w:sz w:val="24"/>
+          <w:lang w:eastAsia="zh-CN"/>
+        </w:rPr>
+      </w:pPr>
+      <w:r>
+        <w:rPr>
+          <w:rFonts w:hint="eastAsia" w:ascii="仿宋" w:hAnsi="仿宋" w:eastAsia="仿宋"/>
+          <w:b/>
+          <w:bCs/>
+          <w:sz w:val="24"/>
+        </w:rPr>
+        <w:t>1、</w:t>
+      </w:r>
+      <w:r>
+        <w:rPr>
+          <w:rFonts w:hint="eastAsia" w:ascii="仿宋" w:hAnsi="仿宋" w:eastAsia="仿宋"/>
+          <w:b/>
+          <w:bCs/>
+          <w:sz w:val="24"/>
+          <w:lang w:eastAsia="zh-CN"/>
+        </w:rPr>
+        <w:t>（）</w:t>
+      </w:r>
+    </w:p>
+    <w:p>
+      <w:pPr>
+        <w:rPr>
+          <w:rFonts w:hint="eastAsia" w:ascii="仿宋" w:hAnsi="仿宋" w:eastAsia="仿宋"/>
+          <w:b/>
+          <w:bCs/>
+          <w:sz w:val="24"/>
+        </w:rPr>
+      </w:pPr>
+      <w:r>
+        <w:rPr>
+          <w:rFonts w:hint="eastAsia" w:ascii="仿宋" w:hAnsi="仿宋" w:eastAsia="仿宋"/>
+          <w:b/>
+          <w:bCs/>
+          <w:sz w:val="24"/>
+        </w:rPr>
+        <w:t>扣分：</w:t>
+      </w:r>
+    </w:p>
+    <w:p>
+      <w:pPr>
+        <w:rPr>
+          <w:rFonts w:hint="eastAsia" w:ascii="仿宋" w:hAnsi="仿宋" w:eastAsia="仿宋"/>
+          <w:b/>
+          <w:bCs/>
+          <w:sz w:val="24"/>
+          <w:lang w:eastAsia="zh-CN"/>
+        </w:rPr>
+      </w:pPr>
+      <w:r>
+        <w:rPr>
+          <w:rFonts w:hint="eastAsia" w:ascii="仿宋" w:hAnsi="仿宋" w:eastAsia="仿宋"/>
+          <w:b/>
+          <w:bCs/>
+          <w:sz w:val="24"/>
+        </w:rPr>
+        <w:t>2、</w:t>
+      </w:r>
+      <w:r>
+        <w:rPr>
+          <w:rFonts w:hint="eastAsia" w:ascii="仿宋" w:hAnsi="仿宋" w:eastAsia="仿宋"/>
+          <w:b/>
+          <w:bCs/>
+          <w:sz w:val="24"/>
+          <w:lang w:eastAsia="zh-CN"/>
+        </w:rPr>
+        <w:t>（）</w:t>
+      </w:r>
+    </w:p>
+    <w:p>
+      <w:pPr>
+        <w:rPr>
+          <w:rFonts w:hint="eastAsia" w:ascii="仿宋" w:hAnsi="仿宋" w:eastAsia="仿宋"/>
+          <w:b/>
+          <w:bCs/>
+          <w:sz w:val="24"/>
+        </w:rPr>
+      </w:pPr>
+      <w:r>
+        <w:rPr>
+          <w:rFonts w:hint="eastAsia" w:ascii="仿宋" w:hAnsi="仿宋" w:eastAsia="仿宋"/>
+          <w:b/>
+          <w:bCs/>
+          <w:sz w:val="24"/>
+        </w:rPr>
+        <w:t>扣分：</w:t>
+      </w:r>
+    </w:p>
+    <w:p>
+      <w:pPr>
+        <w:rPr>
+          <w:rFonts w:hint="eastAsia" w:ascii="仿宋" w:hAnsi="仿宋" w:eastAsia="仿宋"/>
+          <w:b/>
+          <w:bCs/>
+          <w:sz w:val="24"/>
+          <w:lang w:eastAsia="zh-CN"/>
+        </w:rPr>
+      </w:pPr>
+      <w:r>
+        <w:rPr>
+          <w:rFonts w:hint="eastAsia" w:ascii="仿宋" w:hAnsi="仿宋" w:eastAsia="仿宋"/>
+          <w:b/>
+          <w:bCs/>
+          <w:sz w:val="24"/>
+        </w:rPr>
+        <w:t>3、</w:t>
+      </w:r>
+      <w:r>
+        <w:rPr>
+          <w:rFonts w:hint="eastAsia" w:ascii="仿宋" w:hAnsi="仿宋" w:eastAsia="仿宋"/>
+          <w:b/>
+          <w:bCs/>
+          <w:sz w:val="24"/>
+          <w:lang w:eastAsia="zh-CN"/>
+        </w:rPr>
+        <w:t>（）</w:t>
+      </w:r>
+    </w:p>
+    <w:p>
+      <w:pPr>
+        <w:rPr>
+          <w:rFonts w:hint="eastAsia" w:ascii="仿宋" w:hAnsi="仿宋" w:eastAsia="仿宋"/>
+          <w:b/>
+          <w:bCs/>
+          <w:sz w:val="24"/>
+        </w:rPr>
+      </w:pPr>
+      <w:r>
+        <w:rPr>
+          <w:rFonts w:hint="eastAsia" w:ascii="仿宋" w:hAnsi="仿宋" w:eastAsia="仿宋"/>
+          <w:b/>
+          <w:bCs/>
+          <w:sz w:val="24"/>
+        </w:rPr>
+        <w:t>扣分：</w:t>
       </w:r>
     </w:p>
     <w:p>
@@ -1743,234 +2245,6 @@
       </w:pPr>
       <w:bookmarkStart w:id="0" w:name="_GoBack"/>
       <w:bookmarkEnd w:id="0"/>
-    </w:p>
-    <w:p>
-      <w:pPr>
-        <w:rPr>
-          <w:rFonts w:hint="eastAsia" w:ascii="仿宋" w:hAnsi="仿宋" w:eastAsia="仿宋"/>
-          <w:b/>
-          <w:bCs/>
-          <w:sz w:val="24"/>
-        </w:rPr>
-      </w:pPr>
-      <w:r>
-        <w:rPr>
-          <w:rFonts w:hint="eastAsia" w:ascii="仿宋" w:hAnsi="仿宋" w:eastAsia="仿宋"/>
-          <w:b/>
-          <w:bCs/>
-          <w:sz w:val="24"/>
-        </w:rPr>
-        <w:t>大队：经开大队</w:t>
-      </w:r>
-    </w:p>
-    <w:p>
-      <w:pPr>
-        <w:rPr>
-          <w:rFonts w:ascii="仿宋" w:hAnsi="仿宋" w:eastAsia="仿宋"/>
-          <w:b/>
-          <w:bCs/>
-          <w:sz w:val="24"/>
-        </w:rPr>
-      </w:pPr>
-      <w:r>
-        <w:rPr>
-          <w:rFonts w:hint="eastAsia" w:ascii="仿宋" w:hAnsi="仿宋" w:eastAsia="仿宋"/>
-          <w:b/>
-          <w:bCs/>
-          <w:sz w:val="24"/>
-        </w:rPr>
-        <w:t>题名：</w:t>
-      </w:r>
-    </w:p>
-    <w:p>
-      <w:pPr>
-        <w:rPr>
-          <w:rFonts w:hint="eastAsia" w:ascii="仿宋" w:hAnsi="仿宋" w:eastAsia="仿宋"/>
-          <w:b/>
-          <w:bCs/>
-          <w:sz w:val="24"/>
-        </w:rPr>
-      </w:pPr>
-      <w:r>
-        <w:rPr>
-          <w:rFonts w:hint="eastAsia" w:ascii="仿宋" w:hAnsi="仿宋" w:eastAsia="仿宋"/>
-          <w:b/>
-          <w:bCs/>
-          <w:sz w:val="24"/>
-        </w:rPr>
-        <w:t>编号：</w:t>
-      </w:r>
-    </w:p>
-    <w:p>
-      <w:pPr>
-        <w:rPr>
-          <w:rFonts w:ascii="仿宋" w:hAnsi="仿宋" w:eastAsia="仿宋"/>
-          <w:b/>
-          <w:bCs/>
-          <w:sz w:val="24"/>
-        </w:rPr>
-      </w:pPr>
-      <w:r>
-        <w:rPr>
-          <w:rFonts w:hint="eastAsia" w:ascii="仿宋" w:hAnsi="仿宋" w:eastAsia="仿宋"/>
-          <w:b/>
-          <w:bCs/>
-          <w:sz w:val="24"/>
-        </w:rPr>
-        <w:t>立卷人：</w:t>
-      </w:r>
-    </w:p>
-    <w:p>
-      <w:pPr>
-        <w:rPr>
-          <w:rFonts w:hint="eastAsia" w:ascii="仿宋" w:hAnsi="仿宋" w:eastAsia="仿宋"/>
-          <w:b/>
-          <w:bCs/>
-          <w:sz w:val="24"/>
-        </w:rPr>
-      </w:pPr>
-      <w:r>
-        <w:rPr>
-          <w:rFonts w:hint="eastAsia" w:ascii="仿宋" w:hAnsi="仿宋" w:eastAsia="仿宋"/>
-          <w:b/>
-          <w:bCs/>
-          <w:sz w:val="24"/>
-        </w:rPr>
-        <w:t>检查人：</w:t>
-      </w:r>
-    </w:p>
-    <w:p>
-      <w:pPr>
-        <w:rPr>
-          <w:rFonts w:hint="eastAsia" w:ascii="仿宋" w:hAnsi="仿宋" w:eastAsia="仿宋"/>
-          <w:b/>
-          <w:bCs/>
-          <w:sz w:val="24"/>
-        </w:rPr>
-      </w:pPr>
-      <w:r>
-        <w:rPr>
-          <w:rFonts w:hint="eastAsia" w:ascii="仿宋" w:hAnsi="仿宋" w:eastAsia="仿宋"/>
-          <w:b/>
-          <w:bCs/>
-          <w:sz w:val="24"/>
-        </w:rPr>
-        <w:t>错误</w:t>
-      </w:r>
-    </w:p>
-    <w:p>
-      <w:pPr>
-        <w:rPr>
-          <w:rFonts w:hint="eastAsia" w:ascii="仿宋" w:hAnsi="仿宋" w:eastAsia="仿宋"/>
-          <w:b/>
-          <w:bCs/>
-          <w:sz w:val="24"/>
-        </w:rPr>
-      </w:pPr>
-      <w:r>
-        <w:rPr>
-          <w:rFonts w:hint="eastAsia" w:ascii="仿宋" w:hAnsi="仿宋" w:eastAsia="仿宋"/>
-          <w:b/>
-          <w:bCs/>
-          <w:sz w:val="24"/>
-        </w:rPr>
-        <w:t>1、</w:t>
-      </w:r>
-    </w:p>
-    <w:p>
-      <w:pPr>
-        <w:rPr>
-          <w:rFonts w:hint="eastAsia" w:ascii="仿宋" w:hAnsi="仿宋" w:eastAsia="仿宋"/>
-          <w:b/>
-          <w:bCs/>
-          <w:sz w:val="24"/>
-        </w:rPr>
-      </w:pPr>
-      <w:r>
-        <w:rPr>
-          <w:rFonts w:hint="eastAsia" w:ascii="仿宋" w:hAnsi="仿宋" w:eastAsia="仿宋"/>
-          <w:b/>
-          <w:bCs/>
-          <w:sz w:val="24"/>
-        </w:rPr>
-        <w:t>扣分：</w:t>
-      </w:r>
-    </w:p>
-    <w:p>
-      <w:pPr>
-        <w:rPr>
-          <w:rFonts w:hint="eastAsia" w:ascii="仿宋" w:hAnsi="仿宋" w:eastAsia="仿宋"/>
-          <w:b/>
-          <w:bCs/>
-          <w:sz w:val="24"/>
-        </w:rPr>
-      </w:pPr>
-      <w:r>
-        <w:rPr>
-          <w:rFonts w:hint="eastAsia" w:ascii="仿宋" w:hAnsi="仿宋" w:eastAsia="仿宋"/>
-          <w:b/>
-          <w:bCs/>
-          <w:sz w:val="24"/>
-        </w:rPr>
-        <w:t>2、</w:t>
-      </w:r>
-    </w:p>
-    <w:p>
-      <w:pPr>
-        <w:rPr>
-          <w:rFonts w:hint="eastAsia" w:ascii="仿宋" w:hAnsi="仿宋" w:eastAsia="仿宋"/>
-          <w:b/>
-          <w:bCs/>
-          <w:sz w:val="24"/>
-        </w:rPr>
-      </w:pPr>
-      <w:r>
-        <w:rPr>
-          <w:rFonts w:hint="eastAsia" w:ascii="仿宋" w:hAnsi="仿宋" w:eastAsia="仿宋"/>
-          <w:b/>
-          <w:bCs/>
-          <w:sz w:val="24"/>
-        </w:rPr>
-        <w:t>扣分：</w:t>
-      </w:r>
-    </w:p>
-    <w:p>
-      <w:pPr>
-        <w:rPr>
-          <w:rFonts w:hint="eastAsia" w:ascii="仿宋" w:hAnsi="仿宋" w:eastAsia="仿宋"/>
-          <w:b/>
-          <w:bCs/>
-          <w:sz w:val="24"/>
-        </w:rPr>
-      </w:pPr>
-      <w:r>
-        <w:rPr>
-          <w:rFonts w:hint="eastAsia" w:ascii="仿宋" w:hAnsi="仿宋" w:eastAsia="仿宋"/>
-          <w:b/>
-          <w:bCs/>
-          <w:sz w:val="24"/>
-        </w:rPr>
-        <w:t>3、</w:t>
-      </w:r>
-    </w:p>
-    <w:p>
-      <w:pPr>
-        <w:rPr>
-          <w:rFonts w:hint="eastAsia" w:ascii="仿宋" w:hAnsi="仿宋" w:eastAsia="仿宋"/>
-          <w:b/>
-          <w:bCs/>
-          <w:sz w:val="24"/>
-        </w:rPr>
-      </w:pPr>
-      <w:r>
-        <w:rPr>
-          <w:rFonts w:hint="eastAsia" w:ascii="仿宋" w:hAnsi="仿宋" w:eastAsia="仿宋"/>
-          <w:b/>
-          <w:bCs/>
-          <w:sz w:val="24"/>
-        </w:rPr>
-        <w:t>扣分：</w:t>
-      </w:r>
     </w:p>
     <w:sectPr>
       <w:pgSz w:w="11906" w:h="16838"/>
@@ -2108,7 +2382,7 @@
     <w:lsdException w:qFormat="1" w:unhideWhenUsed="0" w:uiPriority="10" w:semiHidden="0" w:name="Title"/>
     <w:lsdException w:uiPriority="99" w:name="Closing"/>
     <w:lsdException w:uiPriority="99" w:name="Signature"/>
-    <w:lsdException w:uiPriority="1" w:name="Default Paragraph Font"/>
+    <w:lsdException w:qFormat="1" w:uiPriority="1" w:name="Default Paragraph Font"/>
     <w:lsdException w:uiPriority="99" w:name="Body Text"/>
     <w:lsdException w:uiPriority="99" w:name="Body Text Indent"/>
     <w:lsdException w:uiPriority="99" w:name="List Continue"/>
@@ -2146,7 +2420,7 @@
     <w:lsdException w:uiPriority="99" w:name="HTML Sample"/>
     <w:lsdException w:uiPriority="99" w:name="HTML Typewriter"/>
     <w:lsdException w:uiPriority="99" w:name="HTML Variable"/>
-    <w:lsdException w:uiPriority="99" w:name="Normal Table"/>
+    <w:lsdException w:qFormat="1" w:uiPriority="99" w:name="Normal Table"/>
     <w:lsdException w:uiPriority="99" w:name="annotation subject"/>
     <w:lsdException w:uiPriority="99" w:name="Table Simple 1"/>
     <w:lsdException w:uiPriority="99" w:name="Table Simple 2"/>
@@ -2531,12 +2805,14 @@
     <w:name w:val="Default Paragraph Font"/>
     <w:semiHidden/>
     <w:unhideWhenUsed/>
+    <w:qFormat/>
     <w:uiPriority w:val="1"/>
   </w:style>
   <w:style w:type="table" w:default="1" w:styleId="15">
     <w:name w:val="Normal Table"/>
     <w:semiHidden/>
     <w:unhideWhenUsed/>
+    <w:qFormat/>
     <w:uiPriority w:val="99"/>
     <w:tblPr>
       <w:tblCellMar>
@@ -2638,6 +2914,7 @@
     <w:name w:val="标题 1 字符"/>
     <w:basedOn w:val="16"/>
     <w:link w:val="2"/>
+    <w:qFormat/>
     <w:uiPriority w:val="9"/>
     <w:rPr>
       <w:rFonts w:asciiTheme="majorHAnsi" w:hAnsiTheme="majorHAnsi" w:eastAsiaTheme="majorEastAsia" w:cstheme="majorBidi"/>
@@ -2651,6 +2928,7 @@
     <w:basedOn w:val="16"/>
     <w:link w:val="3"/>
     <w:semiHidden/>
+    <w:qFormat/>
     <w:uiPriority w:val="9"/>
     <w:rPr>
       <w:rFonts w:asciiTheme="majorHAnsi" w:hAnsiTheme="majorHAnsi" w:eastAsiaTheme="majorEastAsia" w:cstheme="majorBidi"/>

</xml_diff>